<commit_message>
Regenerate CMI manuscript DOCX without internal draft notes
</commit_message>
<xml_diff>
--- a/submission/cmi_main_manuscript_v1.6_single_author.docx
+++ b/submission/cmi_main_manuscript_v1.6_single_author.docx
@@ -2,30 +2,6 @@
 <file path=word/document.xml><?xml version="1.0" encoding="utf-8"?>
 <w:document xmlns:wpc="http://schemas.microsoft.com/office/word/2010/wordprocessingCanvas" xmlns:mo="http://schemas.microsoft.com/office/mac/office/2008/main" xmlns:mc="http://schemas.openxmlformats.org/markup-compatibility/2006" xmlns:mv="urn:schemas-microsoft-com:mac:vml" xmlns:o="urn:schemas-microsoft-com:office:office" xmlns:r="http://schemas.openxmlformats.org/officeDocument/2006/relationships" xmlns:m="http://schemas.openxmlformats.org/officeDocument/2006/math" xmlns:v="urn:schemas-microsoft-com:vml" xmlns:wp14="http://schemas.microsoft.com/office/word/2010/wordprocessingDrawing" xmlns:wp="http://schemas.openxmlformats.org/drawingml/2006/wordprocessingDrawing" xmlns:w10="urn:schemas-microsoft-com:office:word" xmlns:w="http://schemas.openxmlformats.org/wordprocessingml/2006/main" xmlns:w14="http://schemas.microsoft.com/office/word/2010/wordml" xmlns:wpg="http://schemas.microsoft.com/office/word/2010/wordprocessingGroup" xmlns:wpi="http://schemas.microsoft.com/office/word/2010/wordprocessingInk" xmlns:wne="http://schemas.microsoft.com/office/word/2006/wordml" xmlns:wps="http://schemas.microsoft.com/office/word/2010/wordprocessingShape" mc:Ignorable="w14 wp14">
   <w:body>
-    <w:p>
-      <w:r>
-        <w:rPr>
-          <w:rFonts w:ascii="Times New Roman" w:hAnsi="Times New Roman"/>
-          <w:b w:val="0"/>
-          <w:i w:val="0"/>
-          <w:sz w:val="24"/>
-        </w:rPr>
-        <w:t>Draft v0.9 Step 1 removes internal submission-route and draft-boundary notes from the manuscript body while preserving scientific caution within the Methods, Results and Discussion.</w:t>
-      </w:r>
-    </w:p>
-    <w:p/>
-    <w:p>
-      <w:r>
-        <w:rPr>
-          <w:rFonts w:ascii="Times New Roman" w:hAnsi="Times New Roman"/>
-          <w:b w:val="0"/>
-          <w:i w:val="0"/>
-          <w:sz w:val="24"/>
-        </w:rPr>
-        <w:t>---</w:t>
-      </w:r>
-    </w:p>
-    <w:p/>
     <w:p/>
     <w:p>
       <w:pPr>
@@ -283,17 +259,6 @@
       </w:r>
     </w:p>
     <w:p/>
-    <w:p>
-      <w:r>
-        <w:rPr>
-          <w:rFonts w:ascii="Times New Roman" w:hAnsi="Times New Roman"/>
-          <w:b w:val="0"/>
-          <w:i w:val="0"/>
-          <w:sz w:val="24"/>
-        </w:rPr>
-        <w:t>---</w:t>
-      </w:r>
-    </w:p>
     <w:p/>
     <w:p>
       <w:pPr>
@@ -353,17 +318,6 @@
     </w:p>
     <w:p/>
     <w:p/>
-    <w:p>
-      <w:r>
-        <w:rPr>
-          <w:rFonts w:ascii="Times New Roman" w:hAnsi="Times New Roman"/>
-          <w:b w:val="0"/>
-          <w:i w:val="0"/>
-          <w:sz w:val="24"/>
-        </w:rPr>
-        <w:t>---</w:t>
-      </w:r>
-    </w:p>
     <w:p/>
     <w:p>
       <w:pPr>
@@ -495,17 +449,6 @@
     </w:p>
     <w:p/>
     <w:p/>
-    <w:p>
-      <w:r>
-        <w:rPr>
-          <w:rFonts w:ascii="Times New Roman" w:hAnsi="Times New Roman"/>
-          <w:b w:val="0"/>
-          <w:i w:val="0"/>
-          <w:sz w:val="24"/>
-        </w:rPr>
-        <w:t>---</w:t>
-      </w:r>
-    </w:p>
     <w:p/>
     <w:p>
       <w:pPr>
@@ -705,17 +648,6 @@
       </w:r>
     </w:p>
     <w:p/>
-    <w:p>
-      <w:r>
-        <w:rPr>
-          <w:rFonts w:ascii="Times New Roman" w:hAnsi="Times New Roman"/>
-          <w:b w:val="0"/>
-          <w:i w:val="0"/>
-          <w:sz w:val="24"/>
-        </w:rPr>
-        <w:t>---</w:t>
-      </w:r>
-    </w:p>
     <w:p/>
     <w:p>
       <w:pPr>
@@ -787,17 +719,6 @@
     </w:p>
     <w:p/>
     <w:p/>
-    <w:p>
-      <w:r>
-        <w:rPr>
-          <w:rFonts w:ascii="Times New Roman" w:hAnsi="Times New Roman"/>
-          <w:b w:val="0"/>
-          <w:i w:val="0"/>
-          <w:sz w:val="24"/>
-        </w:rPr>
-        <w:t>---</w:t>
-      </w:r>
-    </w:p>
     <w:p/>
     <w:p>
       <w:pPr>
@@ -898,17 +819,6 @@
       </w:r>
     </w:p>
     <w:p/>
-    <w:p>
-      <w:r>
-        <w:rPr>
-          <w:rFonts w:ascii="Times New Roman" w:hAnsi="Times New Roman"/>
-          <w:b w:val="0"/>
-          <w:i w:val="0"/>
-          <w:sz w:val="24"/>
-        </w:rPr>
-        <w:t>---</w:t>
-      </w:r>
-    </w:p>
     <w:p/>
     <w:p>
       <w:pPr>
@@ -2095,19 +2005,6 @@
       </w:r>
     </w:p>
     <w:p/>
-    <w:p>
-      <w:r>
-        <w:rPr>
-          <w:rFonts w:ascii="Times New Roman" w:hAnsi="Times New Roman"/>
-          <w:b w:val="0"/>
-          <w:i w:val="0"/>
-          <w:sz w:val="24"/>
-        </w:rPr>
-        <w:t>---</w:t>
-      </w:r>
-    </w:p>
-    <w:p/>
-    <w:p/>
     <w:p/>
     <w:p>
       <w:pPr>

</xml_diff>